<commit_message>
Update brief with live-verified Hunter/generic_sales_v2 status and DB access findings
</commit_message>
<xml_diff>
--- a/reference_docs/Charity_Fundraising_DNA_Audit_Brief.docx
+++ b/reference_docs/Charity_Fundraising_DNA_Audit_Brief.docx
@@ -81,7 +81,7 @@
         <w:spacing w:after="80"/>
       </w:pPr>
       <w:r>
-        <w:t xml:space="preserve">The Hunter Audit does not exist in the live repo. Past sessions describe a 6-stage, 38-question hunter_scoring.py build, first lost, then rebuilt and zipped up for you to drop into your real clone. There is no hunter_scoring.py, no generic_hunter file, and no migrations folder anywhere in the current main branch. What is actually live instead is a separate general_sales_v1 to generic_sales_v2 line, an industry-neutral version of the same Media engine. I am not assuming which of these you still want. If the 6-stage Hunter design is still wanted, it needs rebuilding from scratch, or generic_sales_v2 can be treated as its replacement. Your call, flagging it rather than guessing.</w:t>
+        <w:t xml:space="preserve">The Hunter Audit question is resolved, update from later the same evening: the old 6-stage hunter_scoring.py build genuinely never made it into the repo, but you have since relabelled generic_sales_v2 as 'The Hunter' directly in the respondent-facing UI (commit 45f3cde, deployed 7:08pm). I checked it live: respondents 68 and 69 in your Audits table are your own two test runs against generic_sales_v2, one all-worst-answers scoring 3/10/14/11 into The Raw Material, one all-best-answers scoring 100 flat into The Elite Operator. Both scored and classified correctly, so that audit version is properly seeded and working end to end in production, not just in the codebase.</w:t>
       </w:r>
     </w:p>
     <w:p>
@@ -605,33 +605,20 @@
         <w:spacing w:after="80"/>
       </w:pPr>
       <w:r>
-        <w:t xml:space="preserve">Naming: I used charity_fundraising_v1 as a placeholder industry code, matching the lower_snake_case style of media_sales_v1 and generic_sales_v2. Happy to rename.</w:t>
-      </w:r>
-    </w:p>
-    <w:p>
-      <w:pPr>
-        <w:pStyle w:val="ListParagraph"/>
-        <w:numPr>
-          <w:ilvl w:val="0"/>
-          <w:numId w:val="2"/>
-        </w:numPr>
-        <w:spacing w:after="80"/>
-      </w:pPr>
-      <w:r>
-        <w:t xml:space="preserve">Fit into the architecture: the super prompt spec already has an industries concept (media, pharma, automotive, tech) sitting on top of the same scoring engine, which is exactly this shape of extension. The natural move is a fifth industry-flavoured bank rather than a new standalone audit type, but that is a product call, not mine to make.</w:t>
-      </w:r>
-    </w:p>
-    <w:p>
-      <w:pPr>
-        <w:pStyle w:val="ListParagraph"/>
-        <w:numPr>
-          <w:ilvl w:val="0"/>
-          <w:numId w:val="2"/>
-        </w:numPr>
-        <w:spacing w:after="80"/>
-      </w:pPr>
-      <w:r>
-        <w:t xml:space="preserve">The Hunter Audit question above, is it still wanted as a separate build, or has generic_sales_v2 already replaced that plan.</w:t>
+        <w:t xml:space="preserve">Naming: I used charity_fundraising_v1 as a placeholder code, matching the lower_snake_case style of media_sales_v1 and generic_sales_v2. Happy to rename.</w:t>
+      </w:r>
+    </w:p>
+    <w:p>
+      <w:pPr>
+        <w:pStyle w:val="ListParagraph"/>
+        <w:numPr>
+          <w:ilvl w:val="0"/>
+          <w:numId w:val="2"/>
+        </w:numPr>
+        <w:spacing w:after="80"/>
+      </w:pPr>
+      <w:r>
+        <w:t xml:space="preserve">Where it lives: I checked the live dashboard and these are three separate things, not one. audit_versions (media_sales_v1, generic_sales_v2, shown to respondents as Media Sales and The Hunter) is which question bank a person actually takes. Industries (automotive, media, pharma, tech, under Industries in the sidebar) are thinner vertical tags, code, name, description, sitting on top of an audit version, and all four are currently empty containers. Bespoke Clients (under Bespoke, empty right now too) is the mechanism for a one-off tailored engagement with a named client. If this is a general public option anyone can select, it wants to be a new audit_versions row. If it is specifically for one fundraising agency or charity client, Bespoke Clients is the more direct fit. I do not know which this is for, that is the actual open question now.</w:t>
       </w:r>
     </w:p>
     <w:p>
@@ -661,59 +648,59 @@
         <w:spacing w:after="140"/>
       </w:pPr>
       <w:r>
-        <w:t xml:space="preserve">Same constraint as last time: this session has no git credentials and no access to your Postgres instance, so I cannot push or seed anything myself. Once you have confirmed the decisions above, the mechanical steps are:</w:t>
-      </w:r>
-    </w:p>
-    <w:p>
-      <w:pPr>
-        <w:pStyle w:val="ListParagraph"/>
-        <w:numPr>
-          <w:ilvl w:val="0"/>
-          <w:numId w:val="2"/>
-        </w:numPr>
-        <w:spacing w:after="80"/>
-      </w:pPr>
-      <w:r>
-        <w:t xml:space="preserve">Drop charity_fundraising_v1_full.json into reference_docs/ in your real clone, alongside the existing media_sales_v1_* files.</w:t>
-      </w:r>
-    </w:p>
-    <w:p>
-      <w:pPr>
-        <w:pStyle w:val="ListParagraph"/>
-        <w:numPr>
-          <w:ilvl w:val="0"/>
-          <w:numId w:val="2"/>
-        </w:numPr>
-        <w:spacing w:after="80"/>
-      </w:pPr>
-      <w:r>
-        <w:t xml:space="preserve">Add the industry (or audit_versions row, depending on the decision above) and point a seed script at this file, following the same pattern generic_sales_v2's seed script already uses.</w:t>
-      </w:r>
-    </w:p>
-    <w:p>
-      <w:pPr>
-        <w:pStyle w:val="ListParagraph"/>
-        <w:numPr>
-          <w:ilvl w:val="0"/>
-          <w:numId w:val="2"/>
-        </w:numPr>
-        <w:spacing w:after="80"/>
-      </w:pPr>
-      <w:r>
-        <w:t xml:space="preserve">No scoring engine changes needed. band_thresholds_json, the archetype classifier and the report generator are all already industry-agnostic per the architecture doc.</w:t>
-      </w:r>
-    </w:p>
-    <w:p>
-      <w:pPr>
-        <w:pStyle w:val="ListParagraph"/>
-        <w:numPr>
-          <w:ilvl w:val="0"/>
-          <w:numId w:val="2"/>
-        </w:numPr>
-        <w:spacing w:after="80"/>
-      </w:pPr>
-      <w:r>
-        <w:t xml:space="preserve">Take the audit once yourself end to end before it goes anywhere near a real fundraising team.</w:t>
+        <w:t xml:space="preserve">Update: both files are already up, as reference material only. They are sitting in pull request #14 (add-charity-fundraising-audit into main), untouched otherwise, nothing merged, nothing deployed. I also checked whether I could reach your production database directly through Render's Shell tab, using the same browser-driven approach that got the GitHub upload done. The environment itself blocked that navigation outright, not a judgement call on my part, a hard stop. I did not attempt to work around it. Once you have confirmed the decisions above, the remaining mechanical steps are still yours:</w:t>
+      </w:r>
+    </w:p>
+    <w:p>
+      <w:pPr>
+        <w:pStyle w:val="ListParagraph"/>
+        <w:numPr>
+          <w:ilvl w:val="0"/>
+          <w:numId w:val="2"/>
+        </w:numPr>
+        <w:spacing w:after="80"/>
+      </w:pPr>
+      <w:r>
+        <w:t xml:space="preserve">Review and merge PR #14, or ask me to adjust it first.</w:t>
+      </w:r>
+    </w:p>
+    <w:p>
+      <w:pPr>
+        <w:pStyle w:val="ListParagraph"/>
+        <w:numPr>
+          <w:ilvl w:val="0"/>
+          <w:numId w:val="2"/>
+        </w:numPr>
+        <w:spacing w:after="80"/>
+      </w:pPr>
+      <w:r>
+        <w:t xml:space="preserve">Add the audit_versions row (or Bespoke Client, per the decision above) and point a seed script at charity_fundraising_v1_full.json, following the same pattern generic_sales_v2's seed script already uses.</w:t>
+      </w:r>
+    </w:p>
+    <w:p>
+      <w:pPr>
+        <w:pStyle w:val="ListParagraph"/>
+        <w:numPr>
+          <w:ilvl w:val="0"/>
+          <w:numId w:val="2"/>
+        </w:numPr>
+        <w:spacing w:after="80"/>
+      </w:pPr>
+      <w:r>
+        <w:t xml:space="preserve">No scoring engine changes needed. band_thresholds_json, the archetype classifier and the report generator are all already version-agnostic, generic_sales_v2 proves that pattern works.</w:t>
+      </w:r>
+    </w:p>
+    <w:p>
+      <w:pPr>
+        <w:pStyle w:val="ListParagraph"/>
+        <w:numPr>
+          <w:ilvl w:val="0"/>
+          <w:numId w:val="2"/>
+        </w:numPr>
+        <w:spacing w:after="80"/>
+      </w:pPr>
+      <w:r>
+        <w:t xml:space="preserve">Take the audit once yourself end to end, the way you did with generic_sales_v2 today, before it goes anywhere near a real fundraising team.</w:t>
       </w:r>
     </w:p>
     <w:p>
@@ -733,7 +720,7 @@
           <w:sz w:val="20"/>
           <w:szCs w:val="20"/>
         </w:rPr>
-        <w:t xml:space="preserve">Prepared overnight from the live decipher repo (main branch) plus public fundraising and telemarketing-compliance research. Nothing in this brief was pushed to GitHub or your database, everything is in this file and the attached JSON.</w:t>
+        <w:t xml:space="preserve">Prepared from the live decipher repo (main and PR #14), a read-only pass over the Render dashboard and the live app.deciphersales.com.au, plus public fundraising and telemarketing-compliance research. No database was written to, and nothing merged to main.</w:t>
       </w:r>
     </w:p>
     <w:sectPr>

</xml_diff>